<commit_message>
Fix citation errors: undefined [40]->[39], realign swapped [21-24]
- [40] was cited in Sec 3.4 but reference list ends at [39]; corrected to
  [39] (Pohl et al., intermetallic precipitation in duplex SS welds).
- Realigned citations [21]-[24] whose subjects were mismatched after the
  earlier de-duplication/renumbering:
  * ER2594 pitting/composition claim now cites [21] Nilsson (super duplex)
  * DuPont 0.75-0.85 arc-efficiency claim now cites [22] DuPont & Marder
  * MIG welding-parameter recommendation now cites [12, 23] Kou + Lawson
  * Predictive solidification-tools reference [24] Vitek moved to Sec 3.1
- Verified: 39 defined / 39 cited, no orphans, strictly sequential order.
</commit_message>
<xml_diff>
--- a/Manuscript_SS440_MIG_Welding_Fillers.docx
+++ b/Manuscript_SS440_MIG_Welding_Fillers.docx
@@ -94,7 +94,7 @@
     <w:p/>
     <w:p>
       <w:r>
-        <w:t xml:space="preserve">The martensitic filler ER410 is used to produce ferritic and martensitic phases, which can increase the hardness of the weld metal, but can cause micro-cracking when used with incorrect parameters [18]. Furthermore, the production of hard untempered martensite during cooling decreases ductility and toughness and increases the risk of weld cracking [19]. The super duplex filler ER2594 has been the subject of much interest as it is formulated to produce a two-phase microstructure (austenite and ferrite) that offers a desirable balance of good toughness, high strength and excellent resistance to stress-corrosion cracking. The phase balance and properties of super duplex welds, however, are highly dependent on the heat input, chemical dilution during welding and cooling rate [20, 21]. ER2594 has a high chromium, molybdenum, nitrogen and nickel content, which helps to make it highly pitting resistant [22].</w:t>
+        <w:t xml:space="preserve">The martensitic filler ER410 is used to produce ferritic and martensitic phases, which can increase the hardness of the weld metal, but can cause micro-cracking when used with incorrect parameters [18]. Furthermore, the production of hard untempered martensite during cooling decreases ductility and toughness and increases the risk of weld cracking [19]. The super duplex filler ER2594 has been the subject of much interest as it is formulated to produce a two-phase microstructure (austenite and ferrite) that offers a desirable balance of good toughness, high strength and excellent resistance to stress-corrosion cracking. The phase balance and properties of super duplex welds, however, are highly dependent on the heat input, chemical dilution during welding and cooling rate [20, 21]. ER2594 has a high chromium, molybdenum, nitrogen and nickel content, which helps to make it highly pitting resistant [21].</w:t>
       </w:r>
     </w:p>
     <w:p/>
@@ -2498,7 +2498,7 @@
     <w:p/>
     <w:p>
       <w:r>
-        <w:t xml:space="preserve">where η is the arc efficiency (assumed to be 0.8), V is the voltage, I is the current in amperes, and S is the welding speed in mm/s. With the stated parameters this gives 1.12 kJ/mm for the root pass and 0.97 kJ/mm for each filler pass; the cumulative heat input over the one root and two filler passes is therefore 1.12 + 2 × 0.97 ≈ 3.06 kJ/mm. The arc efficiency value of η = 0.8 was selected based on the available literature on the gas metal arc welding (GMAW/MIG) process. DuPont found that the arc efficiencies range from 0.75 to 0.85 for MIG welding [23]. Other parameters such as voltage, current and travel speed were also recommended from the literature for MIG welding of 12 mm thick martensitic stainless steel [12, 24].</w:t>
+        <w:t xml:space="preserve">where η is the arc efficiency (assumed to be 0.8), V is the voltage, I is the current in amperes, and S is the welding speed in mm/s. With the stated parameters this gives 1.12 kJ/mm for the root pass and 0.97 kJ/mm for each filler pass; the cumulative heat input over the one root and two filler passes is therefore 1.12 + 2 × 0.97 ≈ 3.06 kJ/mm. The arc efficiency value of η = 0.8 was selected based on the available literature on the gas metal arc welding (GMAW/MIG) process. DuPont found that the arc efficiencies range from 0.75 to 0.85 for MIG welding [22]. Other parameters such as voltage, current and travel speed were also recommended from the literature for MIG welding of 12 mm thick martensitic stainless steel [12, 23].</w:t>
       </w:r>
     </w:p>
     <w:p/>
@@ -2588,7 +2588,7 @@
     <w:p/>
     <w:p>
       <w:r>
-        <w:t xml:space="preserve">The Schaeffler constitution diagram shown in Fig. 4(a) was used to predict the stainless steel weld microstructures using the chromium-equivalent (Cr_eq) and nickel-equivalent (Ni_eq) values. The equivalents were computed with a single consistent pair of formulae, Cr_eq = Cr + Mo + 1.5Si and Ni_eq = Ni + 30C + 0.5Mn + 30N, applied to every alloy in Table 1 so that the four materials can be compared on the same basis. The compositions were used to determine the alloy positions. The very high carbon content of SS440 is a strong austenite promoter (Ni_eq ≈ 30.65), which together with Cr_eq ≈ 19.25 gives Cr_eq/Ni_eq ≈ 0.63 and places the as-solidified weld metal in the primary-austenite (A) region; on cooling, this high-carbon composition subsequently transforms to the martensitic structure that characterises the AISI 440 base metal. The F309L and F2594 alloys lie in the austenite + ferrite (A + F) region, indicating mixed microstructures with both ferrite and austenite phases. F410 (Cr_eq ≈ 13.4, Ni_eq ≈ 4.2) lies in the martensite + ferrite (M + F) region, which indicates that the weld metal will be predominantly martensitic.</w:t>
+        <w:t xml:space="preserve">The Schaeffler constitution diagram shown in Fig. 4(a) was used to predict the stainless steel weld microstructures using the chromium-equivalent (Cr_eq) and nickel-equivalent (Ni_eq) values. The equivalents were computed with a single consistent pair of formulae, Cr_eq = Cr + Mo + 1.5Si and Ni_eq = Ni + 30C + 0.5Mn + 30N, applied to every alloy in Table 1 so that the four materials can be compared on the same basis [24]. The compositions were used to determine the alloy positions. The very high carbon content of SS440 is a strong austenite promoter (Ni_eq ≈ 30.65), which together with Cr_eq ≈ 19.25 gives Cr_eq/Ni_eq ≈ 0.63 and places the as-solidified weld metal in the primary-austenite (A) region; on cooling, this high-carbon composition subsequently transforms to the martensitic structure that characterises the AISI 440 base metal. The F309L and F2594 alloys lie in the austenite + ferrite (A + F) region, indicating mixed microstructures with both ferrite and austenite phases. F410 (Cr_eq ≈ 13.4, Ni_eq ≈ 4.2) lies in the martensite + ferrite (M + F) region, which indicates that the weld metal will be predominantly martensitic.</w:t>
       </w:r>
     </w:p>
     <w:p/>
@@ -2714,7 +2714,7 @@
     <w:p/>
     <w:p>
       <w:r>
-        <w:t xml:space="preserve">The HAZ fracture surface in Fig. 7(f) has a mixed morphology, with tearing ridges and locally ductile fracture features, suggesting that the majority of the material was still ductile. The SEM microstructures in Fig. 8(f) reveal needle-like dendrites with fine secondary precipitates in interdendritic regions, which are believed to be secondary austenite (γ₂) formed by solid-state transformation during cooling [30]. These features directly account for the highest impact-strength values found for the F2594 welds (~275 J in the FZ and ~290 J in the HAZ, the latter higher than the base metal at ~260 J) and the intermediate hardness range (285–310 VHN) that corresponds to a balanced duplex constitution [40].</w:t>
+        <w:t xml:space="preserve">The HAZ fracture surface in Fig. 7(f) has a mixed morphology, with tearing ridges and locally ductile fracture features, suggesting that the majority of the material was still ductile. The SEM microstructures in Fig. 8(f) reveal needle-like dendrites with fine secondary precipitates in interdendritic regions, which are believed to be secondary austenite (γ₂) formed by solid-state transformation during cooling [30]. These features directly account for the highest impact-strength values found for the F2594 welds (~275 J in the FZ and ~290 J in the HAZ, the latter higher than the base metal at ~260 J) and the intermediate hardness range (285–310 VHN) that corresponds to a balanced duplex constitution [39].</w:t>
       </w:r>
     </w:p>
     <w:p/>

</xml_diff>